<commit_message>
25/03/2026 - Observaciones acerca de los reportes de la Elección atendidas
</commit_message>
<xml_diff>
--- a/plantillas/Acta_Computo_Total.docx
+++ b/plantillas/Acta_Computo_Total.docx
@@ -860,7 +860,6 @@
                                       <w:rFonts w:ascii="Arial" w:hAnsi="Arial" w:cs="Arial"/>
                                       <w:sz w:val="16"/>
                                       <w:szCs w:val="16"/>
-                                      <w:u w:val="single"/>
                                     </w:rPr>
                                     <w:t>{hora}</w:t>
                                   </w:r>
@@ -877,7 +876,6 @@
                                       <w:rFonts w:ascii="Arial" w:hAnsi="Arial" w:cs="Arial"/>
                                       <w:sz w:val="16"/>
                                       <w:szCs w:val="16"/>
-                                      <w:u w:val="single"/>
                                     </w:rPr>
                                     <w:t>{</w:t>
                                   </w:r>
@@ -887,7 +885,6 @@
                                       <w:rFonts w:ascii="Arial" w:hAnsi="Arial" w:cs="Arial"/>
                                       <w:sz w:val="16"/>
                                       <w:szCs w:val="16"/>
-                                      <w:u w:val="single"/>
                                     </w:rPr>
                                     <w:t>dia</w:t>
                                   </w:r>
@@ -897,7 +894,6 @@
                                       <w:rFonts w:ascii="Arial" w:hAnsi="Arial" w:cs="Arial"/>
                                       <w:sz w:val="16"/>
                                       <w:szCs w:val="16"/>
-                                      <w:u w:val="single"/>
                                     </w:rPr>
                                     <w:t>}</w:t>
                                   </w:r>
@@ -914,7 +910,6 @@
                                       <w:rFonts w:ascii="Arial" w:hAnsi="Arial" w:cs="Arial"/>
                                       <w:sz w:val="16"/>
                                       <w:szCs w:val="16"/>
-                                      <w:u w:val="single"/>
                                     </w:rPr>
                                     <w:t>{mes}</w:t>
                                   </w:r>
@@ -949,7 +944,6 @@
                                       <w:rFonts w:ascii="Arial" w:hAnsi="Arial" w:cs="Arial"/>
                                       <w:sz w:val="16"/>
                                       <w:szCs w:val="16"/>
-                                      <w:u w:val="single"/>
                                     </w:rPr>
                                     <w:t>{</w:t>
                                   </w:r>
@@ -959,7 +953,6 @@
                                       <w:rFonts w:ascii="Arial" w:hAnsi="Arial" w:cs="Arial"/>
                                       <w:sz w:val="16"/>
                                       <w:szCs w:val="16"/>
-                                      <w:u w:val="single"/>
                                     </w:rPr>
                                     <w:t>dd</w:t>
                                   </w:r>
@@ -969,7 +962,6 @@
                                       <w:rFonts w:ascii="Arial" w:hAnsi="Arial" w:cs="Arial"/>
                                       <w:sz w:val="16"/>
                                       <w:szCs w:val="16"/>
-                                      <w:u w:val="single"/>
                                     </w:rPr>
                                     <w:t>}</w:t>
                                   </w:r>
@@ -986,7 +978,6 @@
                                       <w:rFonts w:ascii="Arial" w:hAnsi="Arial" w:cs="Arial"/>
                                       <w:sz w:val="16"/>
                                       <w:szCs w:val="16"/>
-                                      <w:u w:val="single"/>
                                     </w:rPr>
                                     <w:t>{</w:t>
                                   </w:r>
@@ -996,7 +987,6 @@
                                       <w:rFonts w:ascii="Arial" w:hAnsi="Arial" w:cs="Arial"/>
                                       <w:sz w:val="16"/>
                                       <w:szCs w:val="16"/>
-                                      <w:u w:val="single"/>
                                     </w:rPr>
                                     <w:t>direccion</w:t>
                                   </w:r>
@@ -1006,7 +996,6 @@
                                       <w:rFonts w:ascii="Arial" w:hAnsi="Arial" w:cs="Arial"/>
                                       <w:sz w:val="16"/>
                                       <w:szCs w:val="16"/>
-                                      <w:u w:val="single"/>
                                     </w:rPr>
                                     <w:t>}</w:t>
                                   </w:r>
@@ -1043,7 +1032,6 @@
                                       <w:bCs/>
                                       <w:sz w:val="16"/>
                                       <w:szCs w:val="16"/>
-                                      <w:u w:val="single"/>
                                     </w:rPr>
                                     <w:t>Elección de las comisiones de Participación Comunitaria 2026</w:t>
                                   </w:r>
@@ -1622,7 +1610,6 @@
                                 <w:rFonts w:ascii="Arial" w:hAnsi="Arial" w:cs="Arial"/>
                                 <w:sz w:val="16"/>
                                 <w:szCs w:val="16"/>
-                                <w:u w:val="single"/>
                               </w:rPr>
                               <w:t>{hora}</w:t>
                             </w:r>
@@ -1639,7 +1626,6 @@
                                 <w:rFonts w:ascii="Arial" w:hAnsi="Arial" w:cs="Arial"/>
                                 <w:sz w:val="16"/>
                                 <w:szCs w:val="16"/>
-                                <w:u w:val="single"/>
                               </w:rPr>
                               <w:t>{</w:t>
                             </w:r>
@@ -1649,7 +1635,6 @@
                                 <w:rFonts w:ascii="Arial" w:hAnsi="Arial" w:cs="Arial"/>
                                 <w:sz w:val="16"/>
                                 <w:szCs w:val="16"/>
-                                <w:u w:val="single"/>
                               </w:rPr>
                               <w:t>dia</w:t>
                             </w:r>
@@ -1659,7 +1644,6 @@
                                 <w:rFonts w:ascii="Arial" w:hAnsi="Arial" w:cs="Arial"/>
                                 <w:sz w:val="16"/>
                                 <w:szCs w:val="16"/>
-                                <w:u w:val="single"/>
                               </w:rPr>
                               <w:t>}</w:t>
                             </w:r>
@@ -1676,7 +1660,6 @@
                                 <w:rFonts w:ascii="Arial" w:hAnsi="Arial" w:cs="Arial"/>
                                 <w:sz w:val="16"/>
                                 <w:szCs w:val="16"/>
-                                <w:u w:val="single"/>
                               </w:rPr>
                               <w:t>{mes}</w:t>
                             </w:r>
@@ -1711,7 +1694,6 @@
                                 <w:rFonts w:ascii="Arial" w:hAnsi="Arial" w:cs="Arial"/>
                                 <w:sz w:val="16"/>
                                 <w:szCs w:val="16"/>
-                                <w:u w:val="single"/>
                               </w:rPr>
                               <w:t>{</w:t>
                             </w:r>
@@ -1721,7 +1703,6 @@
                                 <w:rFonts w:ascii="Arial" w:hAnsi="Arial" w:cs="Arial"/>
                                 <w:sz w:val="16"/>
                                 <w:szCs w:val="16"/>
-                                <w:u w:val="single"/>
                               </w:rPr>
                               <w:t>dd</w:t>
                             </w:r>
@@ -1731,7 +1712,6 @@
                                 <w:rFonts w:ascii="Arial" w:hAnsi="Arial" w:cs="Arial"/>
                                 <w:sz w:val="16"/>
                                 <w:szCs w:val="16"/>
-                                <w:u w:val="single"/>
                               </w:rPr>
                               <w:t>}</w:t>
                             </w:r>
@@ -1748,7 +1728,6 @@
                                 <w:rFonts w:ascii="Arial" w:hAnsi="Arial" w:cs="Arial"/>
                                 <w:sz w:val="16"/>
                                 <w:szCs w:val="16"/>
-                                <w:u w:val="single"/>
                               </w:rPr>
                               <w:t>{</w:t>
                             </w:r>
@@ -1758,7 +1737,6 @@
                                 <w:rFonts w:ascii="Arial" w:hAnsi="Arial" w:cs="Arial"/>
                                 <w:sz w:val="16"/>
                                 <w:szCs w:val="16"/>
-                                <w:u w:val="single"/>
                               </w:rPr>
                               <w:t>direccion</w:t>
                             </w:r>
@@ -1768,7 +1746,6 @@
                                 <w:rFonts w:ascii="Arial" w:hAnsi="Arial" w:cs="Arial"/>
                                 <w:sz w:val="16"/>
                                 <w:szCs w:val="16"/>
-                                <w:u w:val="single"/>
                               </w:rPr>
                               <w:t>}</w:t>
                             </w:r>
@@ -1805,7 +1782,6 @@
                                 <w:bCs/>
                                 <w:sz w:val="16"/>
                                 <w:szCs w:val="16"/>
-                                <w:u w:val="single"/>
                               </w:rPr>
                               <w:t>Elección de las comisiones de Participación Comunitaria 2026</w:t>
                             </w:r>

</xml_diff>

<commit_message>
01/04/2026 - Cambios en los nombres de los reportes y agregación de la descarga de todas las Actas de Cómputo Total y Validación en ZIP
</commit_message>
<xml_diff>
--- a/plantillas/Acta_Computo_Total.docx
+++ b/plantillas/Acta_Computo_Total.docx
@@ -1033,7 +1033,27 @@
                                       <w:sz w:val="16"/>
                                       <w:szCs w:val="16"/>
                                     </w:rPr>
-                                    <w:t>Elección de las comisiones de Participación Comunitaria 2026</w:t>
+                                    <w:t xml:space="preserve">Elección de las </w:t>
+                                  </w:r>
+                                  <w:r>
+                                    <w:rPr>
+                                      <w:rFonts w:ascii="Arial" w:hAnsi="Arial" w:cs="Arial"/>
+                                      <w:b/>
+                                      <w:bCs/>
+                                      <w:sz w:val="16"/>
+                                      <w:szCs w:val="16"/>
+                                    </w:rPr>
+                                    <w:t>C</w:t>
+                                  </w:r>
+                                  <w:r>
+                                    <w:rPr>
+                                      <w:rFonts w:ascii="Arial" w:hAnsi="Arial" w:cs="Arial"/>
+                                      <w:b/>
+                                      <w:bCs/>
+                                      <w:sz w:val="16"/>
+                                      <w:szCs w:val="16"/>
+                                    </w:rPr>
+                                    <w:t>omisiones de Participación Comunitaria 2026</w:t>
                                   </w:r>
                                   <w:r>
                                     <w:rPr>
@@ -1783,7 +1803,27 @@
                                 <w:sz w:val="16"/>
                                 <w:szCs w:val="16"/>
                               </w:rPr>
-                              <w:t>Elección de las comisiones de Participación Comunitaria 2026</w:t>
+                              <w:t xml:space="preserve">Elección de las </w:t>
+                            </w:r>
+                            <w:r>
+                              <w:rPr>
+                                <w:rFonts w:ascii="Arial" w:hAnsi="Arial" w:cs="Arial"/>
+                                <w:b/>
+                                <w:bCs/>
+                                <w:sz w:val="16"/>
+                                <w:szCs w:val="16"/>
+                              </w:rPr>
+                              <w:t>C</w:t>
+                            </w:r>
+                            <w:r>
+                              <w:rPr>
+                                <w:rFonts w:ascii="Arial" w:hAnsi="Arial" w:cs="Arial"/>
+                                <w:b/>
+                                <w:bCs/>
+                                <w:sz w:val="16"/>
+                                <w:szCs w:val="16"/>
+                              </w:rPr>
+                              <w:t>omisiones de Participación Comunitaria 2026</w:t>
                             </w:r>
                             <w:r>
                               <w:rPr>

</xml_diff>